<commit_message>
Add detailed timeline with programmer assignments and restructure related work
</commit_message>
<xml_diff>
--- a/proposal.docx
+++ b/proposal.docx
@@ -191,14 +191,32 @@
           <w:color w:val="000000" w:themeColor="text1"/>
           <w:lang w:val="en-US"/>
         </w:rPr>
-        <w:t>For the final project, we have decided to create a card game called rummy. We picked this particular card game because it is not too simple or complex; it suits our programming level. It’s also a perfect game to play against a computer, allowing for the two of us to code different sections of the program.</w:t>
+        <w:t xml:space="preserve">For the final project, we have decided to create a card game called rummy. We picked this </w:t>
+      </w:r>
+      <w:proofErr w:type="gramStart"/>
+      <w:r>
+        <w:rPr>
+          <w:rFonts w:ascii="Times New Roman" w:eastAsia="Times New Roman" w:hAnsi="Times New Roman" w:cs="Times New Roman"/>
+          <w:color w:val="000000" w:themeColor="text1"/>
+          <w:lang w:val="en-US"/>
+        </w:rPr>
+        <w:t>particular card</w:t>
+      </w:r>
+      <w:proofErr w:type="gramEnd"/>
+      <w:r>
+        <w:rPr>
+          <w:rFonts w:ascii="Times New Roman" w:eastAsia="Times New Roman" w:hAnsi="Times New Roman" w:cs="Times New Roman"/>
+          <w:color w:val="000000" w:themeColor="text1"/>
+          <w:lang w:val="en-US"/>
+        </w:rPr>
+        <w:t xml:space="preserve"> game because it is not too simple or complex; it suits our programming level. It’s also a perfect game to play against a computer, allowing for the two of us to code different sections of the program.</w:t>
       </w:r>
     </w:p>
     <w:p>
       <w:pPr>
         <w:spacing w:after="0"/>
         <w:rPr>
-          <w:rFonts w:ascii="EB Garamond" w:eastAsia="EB Garamond" w:hAnsi="EB Garamond" w:cs="EB Garamond"/>
+          <w:rFonts w:ascii="Times New Roman" w:eastAsia="Times New Roman" w:hAnsi="Times New Roman" w:cs="Times New Roman"/>
           <w:color w:val="000000" w:themeColor="text1"/>
           <w:lang w:val="en-US"/>
         </w:rPr>
@@ -261,7 +279,7 @@
           <w:bCs/>
           <w:lang w:val="en-US"/>
         </w:rPr>
-        <w:t xml:space="preserve"> First Related Work: </w:t>
+        <w:t xml:space="preserve"> Related Work: </w:t>
       </w:r>
       <w:r>
         <w:rPr>
@@ -326,7 +344,15 @@
           <w:rFonts w:ascii="Times New Roman" w:hAnsi="Times New Roman" w:cs="Times New Roman"/>
           <w:lang w:val="en-US"/>
         </w:rPr>
-        <w:t xml:space="preserve">For example, a run can consist of a six </w:t>
+        <w:t xml:space="preserve">For example, a run can consist of </w:t>
+      </w:r>
+      <w:proofErr w:type="gramStart"/>
+      <w:r>
+        <w:rPr>
+          <w:rFonts w:ascii="Times New Roman" w:hAnsi="Times New Roman" w:cs="Times New Roman"/>
+          <w:lang w:val="en-US"/>
+        </w:rPr>
+        <w:t xml:space="preserve">a six </w:t>
       </w:r>
       <w:r>
         <w:rPr>
@@ -335,6 +361,7 @@
         </w:rPr>
         <w:t>of</w:t>
       </w:r>
+      <w:proofErr w:type="gramEnd"/>
       <w:r>
         <w:rPr>
           <w:rFonts w:ascii="Times New Roman" w:hAnsi="Times New Roman" w:cs="Times New Roman"/>
@@ -394,7 +421,31 @@
           <w:rFonts w:ascii="Times New Roman" w:hAnsi="Times New Roman" w:cs="Times New Roman"/>
           <w:lang w:val="en-US"/>
         </w:rPr>
-        <w:t>The user will go first, drawing a card from either the stock or the discard pile. Then the player will see if they can create any meld combinations or lay off one (or more) of their cards. If the player cannot make any combinations or lay off a card, then they must discard one of their cards. If the player can meld some of their cards, they will create as many melds as possible and/or lay off a card; after this, the player will discard one of their cards, and it’s the next player’s turn, following the same rules.</w:t>
+        <w:t xml:space="preserve">The user will go first, drawing a card from either the stock or the discard pile. Then the player will see if they can create any </w:t>
+      </w:r>
+      <w:proofErr w:type="gramStart"/>
+      <w:r>
+        <w:rPr>
+          <w:rFonts w:ascii="Times New Roman" w:hAnsi="Times New Roman" w:cs="Times New Roman"/>
+          <w:lang w:val="en-US"/>
+        </w:rPr>
+        <w:t>meld</w:t>
+      </w:r>
+      <w:proofErr w:type="gramEnd"/>
+      <w:r>
+        <w:rPr>
+          <w:rFonts w:ascii="Times New Roman" w:hAnsi="Times New Roman" w:cs="Times New Roman"/>
+          <w:lang w:val="en-US"/>
+        </w:rPr>
+        <w:t xml:space="preserve"> combinations or lay off one (or more) of their cards. If the </w:t>
+      </w:r>
+      <w:r>
+        <w:rPr>
+          <w:rFonts w:ascii="Times New Roman" w:hAnsi="Times New Roman" w:cs="Times New Roman"/>
+          <w:lang w:val="en-US"/>
+        </w:rPr>
+        <w:lastRenderedPageBreak/>
+        <w:t>player cannot make any combinations or lay off a card, then they must discard one of their cards. If the player can meld some of their cards, they will create as many melds as possible and/or lay off a card; after this, the player will discard one of their cards, and it’s the next player’s turn, following the same rules.</w:t>
       </w:r>
     </w:p>
     <w:p>
@@ -404,88 +455,6 @@
           <w:lang w:val="en-US"/>
         </w:rPr>
         <w:t>The first person to sort their entire hand into the above combinations with a final card to place in the discard pile wins the game.</w:t>
-      </w:r>
-    </w:p>
-    <w:p>
-      <w:pPr>
-        <w:rPr>
-          <w:ins w:id="0" w:author="Ruhani Jindal" w:date="2025-01-20T18:12:00Z" w16du:dateUtc="2025-01-21T00:12:00Z"/>
-          <w:rFonts w:ascii="Times New Roman" w:hAnsi="Times New Roman" w:cs="Times New Roman"/>
-          <w:lang w:val="en-US"/>
-        </w:rPr>
-      </w:pPr>
-      <w:r>
-        <w:rPr>
-          <w:rFonts w:ascii="Times New Roman" w:hAnsi="Times New Roman" w:cs="Times New Roman"/>
-          <w:b/>
-          <w:bCs/>
-          <w:lang w:val="en-US"/>
-        </w:rPr>
-        <w:t xml:space="preserve">b. Second Related Work/Inspiration: </w:t>
-      </w:r>
-      <w:del w:id="1" w:author="Ruhani Jindal" w:date="2025-01-20T18:12:00Z" w16du:dateUtc="2025-01-21T00:12:00Z">
-        <w:r>
-          <w:rPr>
-            <w:rFonts w:ascii="Times New Roman" w:hAnsi="Times New Roman" w:cs="Times New Roman"/>
-            <w:lang w:val="en-US"/>
-          </w:rPr>
-          <w:delText>stuff</w:delText>
-        </w:r>
-      </w:del>
-      <w:ins w:id="2" w:author="Ruhani Jindal" w:date="2025-01-20T18:12:00Z" w16du:dateUtc="2025-01-21T00:12:00Z">
-        <w:r>
-          <w:rPr>
-            <w:rFonts w:ascii="Times New Roman" w:hAnsi="Times New Roman" w:cs="Times New Roman"/>
-            <w:lang w:val="en-US"/>
-          </w:rPr>
-          <w:t>Online Card Games</w:t>
-        </w:r>
-      </w:ins>
-    </w:p>
-    <w:p>
-      <w:pPr>
-        <w:rPr>
-          <w:rFonts w:ascii="Times New Roman" w:hAnsi="Times New Roman" w:cs="Times New Roman"/>
-          <w:lang w:val="en-US"/>
-        </w:rPr>
-      </w:pPr>
-      <w:ins w:id="3" w:author="Ruhani Jindal" w:date="2025-01-20T18:12:00Z">
-        <w:r>
-          <w:rPr>
-            <w:rFonts w:ascii="Times New Roman" w:hAnsi="Times New Roman" w:cs="Times New Roman"/>
-            <w:lang w:val="en-US"/>
-          </w:rPr>
-          <w:t xml:space="preserve">we have seen many other online card games which </w:t>
-        </w:r>
-        <w:r>
-          <w:rPr>
-            <w:rFonts w:ascii="Times New Roman" w:hAnsi="Times New Roman" w:cs="Times New Roman"/>
-            <w:lang w:val="en-US"/>
-          </w:rPr>
-          <w:t>gave us ideas</w:t>
-        </w:r>
-      </w:ins>
-    </w:p>
-    <w:p>
-      <w:pPr>
-        <w:rPr>
-          <w:rFonts w:ascii="Times New Roman" w:hAnsi="Times New Roman" w:cs="Times New Roman"/>
-          <w:lang w:val="en-US"/>
-        </w:rPr>
-      </w:pPr>
-      <w:r>
-        <w:rPr>
-          <w:rFonts w:ascii="Times New Roman" w:hAnsi="Times New Roman" w:cs="Times New Roman"/>
-          <w:lang w:val="en-US"/>
-        </w:rPr>
-        <w:t xml:space="preserve">We researched different intermediate card games and played some computer versions </w:t>
-      </w:r>
-      <w:r>
-        <w:rPr>
-          <w:rFonts w:ascii="Times New Roman" w:hAnsi="Times New Roman" w:cs="Times New Roman"/>
-          <w:lang w:val="en-US"/>
-        </w:rPr>
-        <w:t>to test which ones would suit our level of programming experience.</w:t>
       </w:r>
     </w:p>
     <w:p>
@@ -1089,6 +1058,7 @@
           <w:rFonts w:ascii="Times New Roman" w:hAnsi="Times New Roman" w:cs="Times New Roman"/>
           <w:lang w:val="en-US"/>
         </w:rPr>
+        <w:lastRenderedPageBreak/>
         <w:t>In the beginning of the game, there will be an introduct</w:t>
       </w:r>
       <w:r>
@@ -1142,34 +1112,6 @@
     </w:p>
     <w:p>
       <w:pPr>
-        <w:rPr>
-          <w:rFonts w:ascii="Times New Roman" w:hAnsi="Times New Roman" w:cs="Times New Roman"/>
-          <w:b/>
-          <w:bCs/>
-          <w:lang w:val="en-US"/>
-        </w:rPr>
-      </w:pPr>
-      <w:r>
-        <w:rPr>
-          <w:rFonts w:ascii="Times New Roman" w:hAnsi="Times New Roman" w:cs="Times New Roman"/>
-          <w:b/>
-          <w:bCs/>
-          <w:lang w:val="en-US"/>
-        </w:rPr>
-        <w:t xml:space="preserve">e. </w:t>
-      </w:r>
-      <w:r>
-        <w:rPr>
-          <w:rFonts w:ascii="Times New Roman" w:hAnsi="Times New Roman" w:cs="Times New Roman"/>
-          <w:b/>
-          <w:bCs/>
-          <w:lang w:val="en-US"/>
-        </w:rPr>
-        <w:t>User Interface</w:t>
-      </w:r>
-    </w:p>
-    <w:p>
-      <w:pPr>
         <w:pStyle w:val="ListParagraph"/>
         <w:numPr>
           <w:ilvl w:val="0"/>
@@ -1185,14 +1127,35 @@
           <w:rFonts w:ascii="Times New Roman" w:hAnsi="Times New Roman" w:cs="Times New Roman"/>
           <w:lang w:val="en-US"/>
         </w:rPr>
-        <w:t>After every turn, the user will see an updated version of their hand</w:t>
-      </w:r>
-      <w:r>
-        <w:rPr>
-          <w:rFonts w:ascii="Times New Roman" w:hAnsi="Times New Roman" w:cs="Times New Roman"/>
-          <w:lang w:val="en-US"/>
-        </w:rPr>
-        <w:t xml:space="preserve"> and the stock/discard pile.</w:t>
+        <w:t>Also, the player can type in “instructions” at any time to see the set of instructions again.</w:t>
+      </w:r>
+    </w:p>
+    <w:p>
+      <w:pPr>
+        <w:rPr>
+          <w:rFonts w:ascii="Times New Roman" w:hAnsi="Times New Roman" w:cs="Times New Roman"/>
+          <w:b/>
+          <w:bCs/>
+          <w:lang w:val="en-US"/>
+        </w:rPr>
+      </w:pPr>
+      <w:r>
+        <w:rPr>
+          <w:rFonts w:ascii="Times New Roman" w:hAnsi="Times New Roman" w:cs="Times New Roman"/>
+          <w:b/>
+          <w:bCs/>
+          <w:lang w:val="en-US"/>
+        </w:rPr>
+        <w:t xml:space="preserve">e. </w:t>
+      </w:r>
+      <w:r>
+        <w:rPr>
+          <w:rFonts w:ascii="Times New Roman" w:hAnsi="Times New Roman" w:cs="Times New Roman"/>
+          <w:b/>
+          <w:bCs/>
+          <w:lang w:val="en-US"/>
+        </w:rPr>
+        <w:t>User Interface</w:t>
       </w:r>
     </w:p>
     <w:p>
@@ -1212,35 +1175,14 @@
           <w:rFonts w:ascii="Times New Roman" w:hAnsi="Times New Roman" w:cs="Times New Roman"/>
           <w:lang w:val="en-US"/>
         </w:rPr>
-        <w:t>Depending on how things turn out, this may be a simple print to the console or possibly even animated.</w:t>
-      </w:r>
-    </w:p>
-    <w:p>
-      <w:pPr>
-        <w:rPr>
-          <w:rFonts w:ascii="Times New Roman" w:hAnsi="Times New Roman" w:cs="Times New Roman"/>
-          <w:b/>
-          <w:bCs/>
-          <w:lang w:val="en-US"/>
-        </w:rPr>
-      </w:pPr>
-      <w:r>
-        <w:rPr>
-          <w:rFonts w:ascii="Times New Roman" w:hAnsi="Times New Roman" w:cs="Times New Roman"/>
-          <w:b/>
-          <w:bCs/>
-          <w:lang w:val="en-US"/>
-        </w:rPr>
-        <w:t xml:space="preserve">f. </w:t>
-      </w:r>
-      <w:r>
-        <w:rPr>
-          <w:rFonts w:ascii="Times New Roman" w:hAnsi="Times New Roman" w:cs="Times New Roman"/>
-          <w:b/>
-          <w:bCs/>
-          <w:lang w:val="en-US"/>
-        </w:rPr>
-        <w:t>Player vs. Computer Logic:</w:t>
+        <w:t>After every turn, the user will see an updated version of their hand</w:t>
+      </w:r>
+      <w:r>
+        <w:rPr>
+          <w:rFonts w:ascii="Times New Roman" w:hAnsi="Times New Roman" w:cs="Times New Roman"/>
+          <w:lang w:val="en-US"/>
+        </w:rPr>
+        <w:t xml:space="preserve"> and the stock/discard pile.</w:t>
       </w:r>
     </w:p>
     <w:p>
@@ -1260,7 +1202,35 @@
           <w:rFonts w:ascii="Times New Roman" w:hAnsi="Times New Roman" w:cs="Times New Roman"/>
           <w:lang w:val="en-US"/>
         </w:rPr>
-        <w:t>Player (User): The player will be able to choose cards to draw and discard, and the system will check if the cards form valid combinations.</w:t>
+        <w:t>Depending on how things turn out, this may be a simple print to the console or possibly even animated.</w:t>
+      </w:r>
+    </w:p>
+    <w:p>
+      <w:pPr>
+        <w:rPr>
+          <w:rFonts w:ascii="Times New Roman" w:hAnsi="Times New Roman" w:cs="Times New Roman"/>
+          <w:b/>
+          <w:bCs/>
+          <w:lang w:val="en-US"/>
+        </w:rPr>
+      </w:pPr>
+      <w:r>
+        <w:rPr>
+          <w:rFonts w:ascii="Times New Roman" w:hAnsi="Times New Roman" w:cs="Times New Roman"/>
+          <w:b/>
+          <w:bCs/>
+          <w:lang w:val="en-US"/>
+        </w:rPr>
+        <w:t xml:space="preserve">f. </w:t>
+      </w:r>
+      <w:r>
+        <w:rPr>
+          <w:rFonts w:ascii="Times New Roman" w:hAnsi="Times New Roman" w:cs="Times New Roman"/>
+          <w:b/>
+          <w:bCs/>
+          <w:lang w:val="en-US"/>
+        </w:rPr>
+        <w:t>Player vs. Computer Logic:</w:t>
       </w:r>
     </w:p>
     <w:p>
@@ -1280,6 +1250,26 @@
           <w:rFonts w:ascii="Times New Roman" w:hAnsi="Times New Roman" w:cs="Times New Roman"/>
           <w:lang w:val="en-US"/>
         </w:rPr>
+        <w:t>Player (User): The player will be able to choose cards to draw and discard, and the system will check if the cards form valid combinations.</w:t>
+      </w:r>
+    </w:p>
+    <w:p>
+      <w:pPr>
+        <w:pStyle w:val="ListParagraph"/>
+        <w:numPr>
+          <w:ilvl w:val="0"/>
+          <w:numId w:val="9"/>
+        </w:numPr>
+        <w:rPr>
+          <w:rFonts w:ascii="Times New Roman" w:hAnsi="Times New Roman" w:cs="Times New Roman"/>
+          <w:lang w:val="en-US"/>
+        </w:rPr>
+      </w:pPr>
+      <w:r>
+        <w:rPr>
+          <w:rFonts w:ascii="Times New Roman" w:hAnsi="Times New Roman" w:cs="Times New Roman"/>
+          <w:lang w:val="en-US"/>
+        </w:rPr>
         <w:t>Computer (AI</w:t>
       </w:r>
       <w:r>
@@ -1410,20 +1400,6 @@
       <w:r>
         <w:rPr>
           <w:rFonts w:ascii="Times New Roman" w:hAnsi="Times New Roman" w:cs="Times New Roman"/>
-          <w:lang w:val="en-US"/>
-        </w:rPr>
-        <w:t xml:space="preserve">Maybe </w:t>
-      </w:r>
-      <w:r>
-        <w:rPr>
-          <w:rFonts w:ascii="Times New Roman" w:hAnsi="Times New Roman" w:cs="Times New Roman"/>
-          <w:lang w:val="en-US"/>
-        </w:rPr>
-        <w:t xml:space="preserve">an </w:t>
-      </w:r>
-      <w:r>
-        <w:rPr>
-          <w:rFonts w:ascii="Times New Roman" w:hAnsi="Times New Roman" w:cs="Times New Roman"/>
         </w:rPr>
         <w:t>Integrated Development Environment (IDE):</w:t>
       </w:r>
@@ -1449,7 +1425,19 @@
         <w:rPr>
           <w:rFonts w:ascii="Times New Roman" w:hAnsi="Times New Roman" w:cs="Times New Roman"/>
         </w:rPr>
-        <w:t xml:space="preserve"> use Visual Studio Code, PyCharm, or any text editor that supports Python.</w:t>
+        <w:t xml:space="preserve"> use Visual Studio Code, PyCharm, </w:t>
+      </w:r>
+      <w:r>
+        <w:rPr>
+          <w:rFonts w:ascii="Times New Roman" w:hAnsi="Times New Roman" w:cs="Times New Roman"/>
+        </w:rPr>
+        <w:t xml:space="preserve">Thonny, </w:t>
+      </w:r>
+      <w:r>
+        <w:rPr>
+          <w:rFonts w:ascii="Times New Roman" w:hAnsi="Times New Roman" w:cs="Times New Roman"/>
+        </w:rPr>
+        <w:t>or any text editor that supports Python.</w:t>
       </w:r>
     </w:p>
     <w:p>
@@ -1615,6 +1603,30 @@
           <w:szCs w:val="28"/>
           <w:lang w:val="en-US"/>
         </w:rPr>
+        <w:br w:type="page"/>
+      </w:r>
+    </w:p>
+    <w:p>
+      <w:pPr>
+        <w:rPr>
+          <w:rFonts w:ascii="Times New Roman" w:hAnsi="Times New Roman" w:cs="Times New Roman"/>
+          <w:b/>
+          <w:bCs/>
+          <w:sz w:val="28"/>
+          <w:szCs w:val="28"/>
+          <w:lang w:val="en-US"/>
+        </w:rPr>
+      </w:pPr>
+      <w:r>
+        <w:rPr>
+          <w:rFonts w:ascii="Times New Roman" w:hAnsi="Times New Roman" w:cs="Times New Roman"/>
+          <w:b/>
+          <w:bCs/>
+          <w:sz w:val="28"/>
+          <w:szCs w:val="28"/>
+          <w:lang w:val="en-US"/>
+        </w:rPr>
+        <w:lastRenderedPageBreak/>
         <w:t>6</w:t>
       </w:r>
       <w:r>
@@ -1647,14 +1659,14 @@
         <w:tblLook w:val="04A0" w:firstRow="1" w:lastRow="0" w:firstColumn="1" w:lastColumn="0" w:noHBand="0" w:noVBand="1"/>
       </w:tblPr>
       <w:tblGrid>
-        <w:gridCol w:w="3116"/>
-        <w:gridCol w:w="3117"/>
-        <w:gridCol w:w="3117"/>
+        <w:gridCol w:w="5524"/>
+        <w:gridCol w:w="1545"/>
+        <w:gridCol w:w="1776"/>
       </w:tblGrid>
       <w:tr>
         <w:tc>
           <w:tcPr>
-            <w:tcW w:w="3116" w:type="dxa"/>
+            <w:tcW w:w="5524" w:type="dxa"/>
           </w:tcPr>
           <w:p>
             <w:pPr>
@@ -1679,7 +1691,7 @@
         </w:tc>
         <w:tc>
           <w:tcPr>
-            <w:tcW w:w="3117" w:type="dxa"/>
+            <w:tcW w:w="272" w:type="dxa"/>
           </w:tcPr>
           <w:p>
             <w:pPr>
@@ -1698,13 +1710,13 @@
                 <w:bCs/>
                 <w:lang w:val="en-US"/>
               </w:rPr>
-              <w:t>Start Time</w:t>
+              <w:t>Programmer</w:t>
             </w:r>
           </w:p>
         </w:tc>
         <w:tc>
           <w:tcPr>
-            <w:tcW w:w="3117" w:type="dxa"/>
+            <w:tcW w:w="1776" w:type="dxa"/>
           </w:tcPr>
           <w:p>
             <w:pPr>
@@ -1731,7 +1743,7 @@
       <w:tr>
         <w:tc>
           <w:tcPr>
-            <w:tcW w:w="3116" w:type="dxa"/>
+            <w:tcW w:w="5524" w:type="dxa"/>
           </w:tcPr>
           <w:p>
             <w:pPr>
@@ -1740,11 +1752,18 @@
                 <w:lang w:val="en-US"/>
               </w:rPr>
             </w:pPr>
+            <w:r>
+              <w:rPr>
+                <w:rFonts w:ascii="Times New Roman" w:hAnsi="Times New Roman" w:cs="Times New Roman"/>
+                <w:lang w:val="en-US"/>
+              </w:rPr>
+              <w:t>Making card deck and shuffling function</w:t>
+            </w:r>
           </w:p>
         </w:tc>
         <w:tc>
           <w:tcPr>
-            <w:tcW w:w="3117" w:type="dxa"/>
+            <w:tcW w:w="272" w:type="dxa"/>
           </w:tcPr>
           <w:p>
             <w:pPr>
@@ -1753,11 +1772,18 @@
                 <w:lang w:val="en-US"/>
               </w:rPr>
             </w:pPr>
+            <w:r>
+              <w:rPr>
+                <w:rFonts w:ascii="Times New Roman" w:hAnsi="Times New Roman" w:cs="Times New Roman"/>
+                <w:lang w:val="en-US"/>
+              </w:rPr>
+              <w:t>Celeste</w:t>
+            </w:r>
           </w:p>
         </w:tc>
         <w:tc>
           <w:tcPr>
-            <w:tcW w:w="3117" w:type="dxa"/>
+            <w:tcW w:w="1776" w:type="dxa"/>
           </w:tcPr>
           <w:p>
             <w:pPr>
@@ -1766,13 +1792,20 @@
                 <w:lang w:val="en-US"/>
               </w:rPr>
             </w:pPr>
+            <w:r>
+              <w:rPr>
+                <w:rFonts w:ascii="Times New Roman" w:hAnsi="Times New Roman" w:cs="Times New Roman"/>
+                <w:lang w:val="en-US"/>
+              </w:rPr>
+              <w:t>February 4</w:t>
+            </w:r>
           </w:p>
         </w:tc>
       </w:tr>
       <w:tr>
         <w:tc>
           <w:tcPr>
-            <w:tcW w:w="3116" w:type="dxa"/>
+            <w:tcW w:w="5524" w:type="dxa"/>
           </w:tcPr>
           <w:p>
             <w:pPr>
@@ -1781,11 +1814,17 @@
                 <w:lang w:val="en-US"/>
               </w:rPr>
             </w:pPr>
+            <w:r>
+              <w:rPr>
+                <w:rFonts w:ascii="Times New Roman" w:hAnsi="Times New Roman" w:cs="Times New Roman"/>
+              </w:rPr>
+              <w:t>Design and implement the instructions screen that appears at the beginning of the game</w:t>
+            </w:r>
           </w:p>
         </w:tc>
         <w:tc>
           <w:tcPr>
-            <w:tcW w:w="3117" w:type="dxa"/>
+            <w:tcW w:w="272" w:type="dxa"/>
           </w:tcPr>
           <w:p>
             <w:pPr>
@@ -1794,11 +1833,18 @@
                 <w:lang w:val="en-US"/>
               </w:rPr>
             </w:pPr>
+            <w:r>
+              <w:rPr>
+                <w:rFonts w:ascii="Times New Roman" w:hAnsi="Times New Roman" w:cs="Times New Roman"/>
+                <w:lang w:val="en-US"/>
+              </w:rPr>
+              <w:t>Ruhani</w:t>
+            </w:r>
           </w:p>
         </w:tc>
         <w:tc>
           <w:tcPr>
-            <w:tcW w:w="3117" w:type="dxa"/>
+            <w:tcW w:w="1776" w:type="dxa"/>
           </w:tcPr>
           <w:p>
             <w:pPr>
@@ -1807,13 +1853,20 @@
                 <w:lang w:val="en-US"/>
               </w:rPr>
             </w:pPr>
+            <w:r>
+              <w:rPr>
+                <w:rFonts w:ascii="Times New Roman" w:hAnsi="Times New Roman" w:cs="Times New Roman"/>
+                <w:lang w:val="en-US"/>
+              </w:rPr>
+              <w:t>February 4</w:t>
+            </w:r>
           </w:p>
         </w:tc>
       </w:tr>
       <w:tr>
         <w:tc>
           <w:tcPr>
-            <w:tcW w:w="3116" w:type="dxa"/>
+            <w:tcW w:w="5524" w:type="dxa"/>
           </w:tcPr>
           <w:p>
             <w:pPr>
@@ -1822,11 +1875,33 @@
                 <w:lang w:val="en-US"/>
               </w:rPr>
             </w:pPr>
+            <w:r>
+              <w:rPr>
+                <w:rFonts w:ascii="Times New Roman" w:hAnsi="Times New Roman" w:cs="Times New Roman"/>
+                <w:lang w:val="en-US"/>
+              </w:rPr>
+              <w:t xml:space="preserve">User Interface </w:t>
+            </w:r>
+          </w:p>
+          <w:p>
+            <w:pPr>
+              <w:rPr>
+                <w:rFonts w:ascii="Times New Roman" w:hAnsi="Times New Roman" w:cs="Times New Roman"/>
+                <w:lang w:val="en-US"/>
+              </w:rPr>
+            </w:pPr>
+            <w:r>
+              <w:rPr>
+                <w:rFonts w:ascii="Times New Roman" w:hAnsi="Times New Roman" w:cs="Times New Roman"/>
+                <w:lang w:val="en-US"/>
+              </w:rPr>
+              <w:t>– what the user sees in each turn</w:t>
+            </w:r>
           </w:p>
         </w:tc>
         <w:tc>
           <w:tcPr>
-            <w:tcW w:w="3117" w:type="dxa"/>
+            <w:tcW w:w="272" w:type="dxa"/>
           </w:tcPr>
           <w:p>
             <w:pPr>
@@ -1835,11 +1910,18 @@
                 <w:lang w:val="en-US"/>
               </w:rPr>
             </w:pPr>
+            <w:r>
+              <w:rPr>
+                <w:rFonts w:ascii="Times New Roman" w:hAnsi="Times New Roman" w:cs="Times New Roman"/>
+                <w:lang w:val="en-US"/>
+              </w:rPr>
+              <w:t>Ruhani</w:t>
+            </w:r>
           </w:p>
         </w:tc>
         <w:tc>
           <w:tcPr>
-            <w:tcW w:w="3117" w:type="dxa"/>
+            <w:tcW w:w="1776" w:type="dxa"/>
           </w:tcPr>
           <w:p>
             <w:pPr>
@@ -1848,14 +1930,397 @@
                 <w:lang w:val="en-US"/>
               </w:rPr>
             </w:pPr>
+            <w:r>
+              <w:rPr>
+                <w:rFonts w:ascii="Times New Roman" w:hAnsi="Times New Roman" w:cs="Times New Roman"/>
+                <w:lang w:val="en-US"/>
+              </w:rPr>
+              <w:t xml:space="preserve">February </w:t>
+            </w:r>
+            <w:r>
+              <w:rPr>
+                <w:rFonts w:ascii="Times New Roman" w:hAnsi="Times New Roman" w:cs="Times New Roman"/>
+                <w:lang w:val="en-US"/>
+              </w:rPr>
+              <w:t>18</w:t>
+            </w:r>
           </w:p>
         </w:tc>
       </w:tr>
       <w:tr>
         <w:tc>
           <w:tcPr>
-            <w:tcW w:w="3116" w:type="dxa"/>
+            <w:tcW w:w="5524" w:type="dxa"/>
           </w:tcPr>
+          <w:p>
+            <w:pPr>
+              <w:rPr>
+                <w:rFonts w:ascii="Times New Roman" w:hAnsi="Times New Roman" w:cs="Times New Roman"/>
+                <w:lang w:val="en-US"/>
+              </w:rPr>
+            </w:pPr>
+            <w:r>
+              <w:rPr>
+                <w:rFonts w:ascii="Times New Roman" w:hAnsi="Times New Roman" w:cs="Times New Roman"/>
+                <w:lang w:val="en-US"/>
+              </w:rPr>
+              <w:t>Meld Detection</w:t>
+            </w:r>
+          </w:p>
+        </w:tc>
+        <w:tc>
+          <w:tcPr>
+            <w:tcW w:w="272" w:type="dxa"/>
+          </w:tcPr>
+          <w:p>
+            <w:pPr>
+              <w:rPr>
+                <w:rFonts w:ascii="Times New Roman" w:hAnsi="Times New Roman" w:cs="Times New Roman"/>
+                <w:lang w:val="en-US"/>
+              </w:rPr>
+            </w:pPr>
+            <w:r>
+              <w:rPr>
+                <w:rFonts w:ascii="Times New Roman" w:hAnsi="Times New Roman" w:cs="Times New Roman"/>
+                <w:lang w:val="en-US"/>
+              </w:rPr>
+              <w:t>Celeste</w:t>
+            </w:r>
+          </w:p>
+        </w:tc>
+        <w:tc>
+          <w:tcPr>
+            <w:tcW w:w="1776" w:type="dxa"/>
+          </w:tcPr>
+          <w:p>
+            <w:pPr>
+              <w:rPr>
+                <w:rFonts w:ascii="Times New Roman" w:hAnsi="Times New Roman" w:cs="Times New Roman"/>
+                <w:lang w:val="en-US"/>
+              </w:rPr>
+            </w:pPr>
+            <w:r>
+              <w:rPr>
+                <w:rFonts w:ascii="Times New Roman" w:hAnsi="Times New Roman" w:cs="Times New Roman"/>
+                <w:lang w:val="en-US"/>
+              </w:rPr>
+              <w:t xml:space="preserve">February </w:t>
+            </w:r>
+            <w:r>
+              <w:rPr>
+                <w:rFonts w:ascii="Times New Roman" w:hAnsi="Times New Roman" w:cs="Times New Roman"/>
+                <w:lang w:val="en-US"/>
+              </w:rPr>
+              <w:t>25</w:t>
+            </w:r>
+          </w:p>
+        </w:tc>
+      </w:tr>
+      <w:tr>
+        <w:tc>
+          <w:tcPr>
+            <w:tcW w:w="5524" w:type="dxa"/>
+          </w:tcPr>
+          <w:p>
+            <w:pPr>
+              <w:rPr>
+                <w:rFonts w:ascii="Times New Roman" w:hAnsi="Times New Roman" w:cs="Times New Roman"/>
+                <w:lang w:val="en-US"/>
+              </w:rPr>
+            </w:pPr>
+            <w:r>
+              <w:rPr>
+                <w:rFonts w:ascii="Times New Roman" w:hAnsi="Times New Roman" w:cs="Times New Roman"/>
+                <w:lang w:val="en-US"/>
+              </w:rPr>
+              <w:t>Laying off a card</w:t>
+            </w:r>
+          </w:p>
+        </w:tc>
+        <w:tc>
+          <w:tcPr>
+            <w:tcW w:w="272" w:type="dxa"/>
+          </w:tcPr>
+          <w:p>
+            <w:pPr>
+              <w:rPr>
+                <w:rFonts w:ascii="Times New Roman" w:hAnsi="Times New Roman" w:cs="Times New Roman"/>
+                <w:lang w:val="en-US"/>
+              </w:rPr>
+            </w:pPr>
+            <w:r>
+              <w:rPr>
+                <w:rFonts w:ascii="Times New Roman" w:hAnsi="Times New Roman" w:cs="Times New Roman"/>
+                <w:lang w:val="en-US"/>
+              </w:rPr>
+              <w:t>Celeste</w:t>
+            </w:r>
+          </w:p>
+        </w:tc>
+        <w:tc>
+          <w:tcPr>
+            <w:tcW w:w="1776" w:type="dxa"/>
+          </w:tcPr>
+          <w:p>
+            <w:pPr>
+              <w:rPr>
+                <w:rFonts w:ascii="Times New Roman" w:hAnsi="Times New Roman" w:cs="Times New Roman"/>
+                <w:lang w:val="en-US"/>
+              </w:rPr>
+            </w:pPr>
+            <w:r>
+              <w:rPr>
+                <w:rFonts w:ascii="Times New Roman" w:hAnsi="Times New Roman" w:cs="Times New Roman"/>
+                <w:lang w:val="en-US"/>
+              </w:rPr>
+              <w:t>February 25</w:t>
+            </w:r>
+          </w:p>
+        </w:tc>
+      </w:tr>
+      <w:tr>
+        <w:tc>
+          <w:tcPr>
+            <w:tcW w:w="5524" w:type="dxa"/>
+          </w:tcPr>
+          <w:p>
+            <w:pPr>
+              <w:rPr>
+                <w:rFonts w:ascii="Times New Roman" w:hAnsi="Times New Roman" w:cs="Times New Roman"/>
+                <w:lang w:val="en-US"/>
+              </w:rPr>
+            </w:pPr>
+            <w:r>
+              <w:rPr>
+                <w:rFonts w:ascii="Times New Roman" w:hAnsi="Times New Roman" w:cs="Times New Roman"/>
+                <w:lang w:val="en-US"/>
+              </w:rPr>
+              <w:t>Win Detection</w:t>
+            </w:r>
+          </w:p>
+        </w:tc>
+        <w:tc>
+          <w:tcPr>
+            <w:tcW w:w="272" w:type="dxa"/>
+          </w:tcPr>
+          <w:p>
+            <w:pPr>
+              <w:rPr>
+                <w:rFonts w:ascii="Times New Roman" w:hAnsi="Times New Roman" w:cs="Times New Roman"/>
+                <w:lang w:val="en-US"/>
+              </w:rPr>
+            </w:pPr>
+            <w:r>
+              <w:rPr>
+                <w:rFonts w:ascii="Times New Roman" w:hAnsi="Times New Roman" w:cs="Times New Roman"/>
+                <w:lang w:val="en-US"/>
+              </w:rPr>
+              <w:t>Ruhani</w:t>
+            </w:r>
+          </w:p>
+        </w:tc>
+        <w:tc>
+          <w:tcPr>
+            <w:tcW w:w="1776" w:type="dxa"/>
+          </w:tcPr>
+          <w:p>
+            <w:pPr>
+              <w:rPr>
+                <w:rFonts w:ascii="Times New Roman" w:hAnsi="Times New Roman" w:cs="Times New Roman"/>
+                <w:lang w:val="en-US"/>
+              </w:rPr>
+            </w:pPr>
+            <w:r>
+              <w:rPr>
+                <w:rFonts w:ascii="Times New Roman" w:hAnsi="Times New Roman" w:cs="Times New Roman"/>
+                <w:lang w:val="en-US"/>
+              </w:rPr>
+              <w:t>March 4</w:t>
+            </w:r>
+          </w:p>
+        </w:tc>
+      </w:tr>
+      <w:tr>
+        <w:tc>
+          <w:tcPr>
+            <w:tcW w:w="5524" w:type="dxa"/>
+          </w:tcPr>
+          <w:p>
+            <w:pPr>
+              <w:rPr>
+                <w:rFonts w:ascii="Times New Roman" w:hAnsi="Times New Roman" w:cs="Times New Roman"/>
+                <w:lang w:val="en-US"/>
+              </w:rPr>
+            </w:pPr>
+            <w:r>
+              <w:rPr>
+                <w:rFonts w:ascii="Times New Roman" w:hAnsi="Times New Roman" w:cs="Times New Roman"/>
+                <w:lang w:val="en-US"/>
+              </w:rPr>
+              <w:t xml:space="preserve">Make </w:t>
+            </w:r>
+            <w:r>
+              <w:rPr>
+                <w:rFonts w:ascii="Times New Roman" w:hAnsi="Times New Roman" w:cs="Times New Roman"/>
+                <w:lang w:val="en-US"/>
+              </w:rPr>
+              <w:t xml:space="preserve">a winning screen </w:t>
+            </w:r>
+            <w:r>
+              <w:rPr>
+                <w:rFonts w:ascii="Times New Roman" w:hAnsi="Times New Roman" w:cs="Times New Roman"/>
+                <w:lang w:val="en-US"/>
+              </w:rPr>
+              <w:t xml:space="preserve">for </w:t>
+            </w:r>
+            <w:r>
+              <w:rPr>
+                <w:rFonts w:ascii="Times New Roman" w:hAnsi="Times New Roman" w:cs="Times New Roman"/>
+                <w:lang w:val="en-US"/>
+              </w:rPr>
+              <w:t>the end of</w:t>
+            </w:r>
+            <w:r>
+              <w:rPr>
+                <w:rFonts w:ascii="Times New Roman" w:hAnsi="Times New Roman" w:cs="Times New Roman"/>
+                <w:lang w:val="en-US"/>
+              </w:rPr>
+              <w:t xml:space="preserve"> the game</w:t>
+            </w:r>
+          </w:p>
+        </w:tc>
+        <w:tc>
+          <w:tcPr>
+            <w:tcW w:w="272" w:type="dxa"/>
+          </w:tcPr>
+          <w:p>
+            <w:pPr>
+              <w:rPr>
+                <w:rFonts w:ascii="Times New Roman" w:hAnsi="Times New Roman" w:cs="Times New Roman"/>
+                <w:lang w:val="en-US"/>
+              </w:rPr>
+            </w:pPr>
+            <w:r>
+              <w:rPr>
+                <w:rFonts w:ascii="Times New Roman" w:hAnsi="Times New Roman" w:cs="Times New Roman"/>
+                <w:lang w:val="en-US"/>
+              </w:rPr>
+              <w:t>Ruhani</w:t>
+            </w:r>
+          </w:p>
+        </w:tc>
+        <w:tc>
+          <w:tcPr>
+            <w:tcW w:w="1776" w:type="dxa"/>
+          </w:tcPr>
+          <w:p>
+            <w:pPr>
+              <w:rPr>
+                <w:rFonts w:ascii="Times New Roman" w:hAnsi="Times New Roman" w:cs="Times New Roman"/>
+                <w:lang w:val="en-US"/>
+              </w:rPr>
+            </w:pPr>
+            <w:r>
+              <w:rPr>
+                <w:rFonts w:ascii="Times New Roman" w:hAnsi="Times New Roman" w:cs="Times New Roman"/>
+                <w:lang w:val="en-US"/>
+              </w:rPr>
+              <w:t>March</w:t>
+            </w:r>
+            <w:r>
+              <w:rPr>
+                <w:rFonts w:ascii="Times New Roman" w:hAnsi="Times New Roman" w:cs="Times New Roman"/>
+                <w:lang w:val="en-US"/>
+              </w:rPr>
+              <w:t xml:space="preserve"> 1</w:t>
+            </w:r>
+            <w:r>
+              <w:rPr>
+                <w:rFonts w:ascii="Times New Roman" w:hAnsi="Times New Roman" w:cs="Times New Roman"/>
+                <w:lang w:val="en-US"/>
+              </w:rPr>
+              <w:t>1</w:t>
+            </w:r>
+          </w:p>
+        </w:tc>
+      </w:tr>
+      <w:tr>
+        <w:trPr>
+          <w:trHeight w:val="300"/>
+        </w:trPr>
+        <w:tc>
+          <w:tcPr>
+            <w:tcW w:w="5524" w:type="dxa"/>
+          </w:tcPr>
+          <w:p>
+            <w:pPr>
+              <w:rPr>
+                <w:rFonts w:ascii="Times New Roman" w:hAnsi="Times New Roman" w:cs="Times New Roman"/>
+                <w:lang w:val="en-US"/>
+              </w:rPr>
+            </w:pPr>
+            <w:r>
+              <w:rPr>
+                <w:rFonts w:ascii="Times New Roman" w:hAnsi="Times New Roman" w:cs="Times New Roman"/>
+              </w:rPr>
+              <w:t>User testing and debugging (playtesting to ensure smooth gameplay and fix issues)</w:t>
+            </w:r>
+          </w:p>
+        </w:tc>
+        <w:tc>
+          <w:tcPr>
+            <w:tcW w:w="272" w:type="dxa"/>
+          </w:tcPr>
+          <w:tbl>
+            <w:tblPr>
+              <w:tblW w:w="0" w:type="auto"/>
+              <w:tblCellSpacing w:w="15" w:type="dxa"/>
+              <w:tblCellMar>
+                <w:top w:w="15" w:type="dxa"/>
+                <w:left w:w="15" w:type="dxa"/>
+                <w:bottom w:w="15" w:type="dxa"/>
+                <w:right w:w="15" w:type="dxa"/>
+              </w:tblCellMar>
+              <w:tblLook w:val="04A0" w:firstRow="1" w:lastRow="0" w:firstColumn="1" w:lastColumn="0" w:noHBand="0" w:noVBand="1"/>
+            </w:tblPr>
+            <w:tblGrid>
+              <w:gridCol w:w="557"/>
+            </w:tblGrid>
+            <w:tr>
+              <w:trPr>
+                <w:tblCellSpacing w:w="15" w:type="dxa"/>
+              </w:trPr>
+              <w:tc>
+                <w:tcPr>
+                  <w:tcW w:w="0" w:type="auto"/>
+                  <w:vAlign w:val="center"/>
+                  <w:hideMark/>
+                </w:tcPr>
+                <w:p>
+                  <w:pPr>
+                    <w:spacing w:after="0" w:line="240" w:lineRule="auto"/>
+                    <w:rPr>
+                      <w:rFonts w:ascii="Times New Roman" w:hAnsi="Times New Roman" w:cs="Times New Roman"/>
+                    </w:rPr>
+                  </w:pPr>
+                  <w:r>
+                    <w:rPr>
+                      <w:rFonts w:ascii="Times New Roman" w:hAnsi="Times New Roman" w:cs="Times New Roman"/>
+                    </w:rPr>
+                    <w:t>Both</w:t>
+                  </w:r>
+                </w:p>
+              </w:tc>
+            </w:tr>
+          </w:tbl>
+          <w:p>
+            <w:pPr>
+              <w:rPr>
+                <w:rFonts w:ascii="Times New Roman" w:hAnsi="Times New Roman" w:cs="Times New Roman"/>
+                <w:vanish/>
+              </w:rPr>
+            </w:pPr>
+          </w:p>
           <w:p>
             <w:pPr>
               <w:rPr>
@@ -1867,7 +2332,7 @@
         </w:tc>
         <w:tc>
           <w:tcPr>
-            <w:tcW w:w="3117" w:type="dxa"/>
+            <w:tcW w:w="1776" w:type="dxa"/>
           </w:tcPr>
           <w:p>
             <w:pPr>
@@ -1876,11 +2341,41 @@
                 <w:lang w:val="en-US"/>
               </w:rPr>
             </w:pPr>
+            <w:r>
+              <w:rPr>
+                <w:rFonts w:ascii="Times New Roman" w:hAnsi="Times New Roman" w:cs="Times New Roman"/>
+              </w:rPr>
+              <w:t>March 18</w:t>
+            </w:r>
+          </w:p>
+        </w:tc>
+      </w:tr>
+      <w:tr>
+        <w:trPr>
+          <w:trHeight w:val="300"/>
+        </w:trPr>
+        <w:tc>
+          <w:tcPr>
+            <w:tcW w:w="5524" w:type="dxa"/>
+          </w:tcPr>
+          <w:p>
+            <w:pPr>
+              <w:rPr>
+                <w:rFonts w:ascii="Times New Roman" w:hAnsi="Times New Roman" w:cs="Times New Roman"/>
+                <w:lang w:val="en-US"/>
+              </w:rPr>
+            </w:pPr>
+            <w:r>
+              <w:rPr>
+                <w:rFonts w:ascii="Times New Roman" w:hAnsi="Times New Roman" w:cs="Times New Roman"/>
+              </w:rPr>
+              <w:t>Final polish of game design, UI, and UX improvements</w:t>
+            </w:r>
           </w:p>
         </w:tc>
         <w:tc>
           <w:tcPr>
-            <w:tcW w:w="3117" w:type="dxa"/>
+            <w:tcW w:w="272" w:type="dxa"/>
           </w:tcPr>
           <w:p>
             <w:pPr>
@@ -1889,6 +2384,91 @@
                 <w:lang w:val="en-US"/>
               </w:rPr>
             </w:pPr>
+            <w:r>
+              <w:rPr>
+                <w:rFonts w:ascii="Times New Roman" w:hAnsi="Times New Roman" w:cs="Times New Roman"/>
+              </w:rPr>
+              <w:t>Both</w:t>
+            </w:r>
+          </w:p>
+        </w:tc>
+        <w:tc>
+          <w:tcPr>
+            <w:tcW w:w="1776" w:type="dxa"/>
+          </w:tcPr>
+          <w:p>
+            <w:pPr>
+              <w:rPr>
+                <w:rFonts w:ascii="Times New Roman" w:hAnsi="Times New Roman" w:cs="Times New Roman"/>
+              </w:rPr>
+            </w:pPr>
+            <w:r>
+              <w:rPr>
+                <w:rFonts w:ascii="Times New Roman" w:hAnsi="Times New Roman" w:cs="Times New Roman"/>
+              </w:rPr>
+              <w:t>March 25</w:t>
+            </w:r>
+          </w:p>
+        </w:tc>
+      </w:tr>
+      <w:tr>
+        <w:trPr>
+          <w:trHeight w:val="300"/>
+        </w:trPr>
+        <w:tc>
+          <w:tcPr>
+            <w:tcW w:w="5524" w:type="dxa"/>
+          </w:tcPr>
+          <w:p>
+            <w:pPr>
+              <w:rPr>
+                <w:rFonts w:ascii="Times New Roman" w:hAnsi="Times New Roman" w:cs="Times New Roman"/>
+                <w:lang w:val="en-US"/>
+              </w:rPr>
+            </w:pPr>
+            <w:r>
+              <w:rPr>
+                <w:rFonts w:ascii="Times New Roman" w:hAnsi="Times New Roman" w:cs="Times New Roman"/>
+              </w:rPr>
+              <w:t>Game launch and presentation preparation</w:t>
+            </w:r>
+          </w:p>
+        </w:tc>
+        <w:tc>
+          <w:tcPr>
+            <w:tcW w:w="272" w:type="dxa"/>
+          </w:tcPr>
+          <w:p>
+            <w:pPr>
+              <w:rPr>
+                <w:rFonts w:ascii="Times New Roman" w:hAnsi="Times New Roman" w:cs="Times New Roman"/>
+                <w:lang w:val="en-US"/>
+              </w:rPr>
+            </w:pPr>
+            <w:r>
+              <w:rPr>
+                <w:rFonts w:ascii="Times New Roman" w:hAnsi="Times New Roman" w:cs="Times New Roman"/>
+              </w:rPr>
+              <w:t>Both</w:t>
+            </w:r>
+          </w:p>
+        </w:tc>
+        <w:tc>
+          <w:tcPr>
+            <w:tcW w:w="1776" w:type="dxa"/>
+          </w:tcPr>
+          <w:p>
+            <w:pPr>
+              <w:rPr>
+                <w:rFonts w:ascii="Times New Roman" w:hAnsi="Times New Roman" w:cs="Times New Roman"/>
+              </w:rPr>
+            </w:pPr>
+            <w:r>
+              <w:rPr>
+                <w:rFonts w:ascii="Times New Roman" w:hAnsi="Times New Roman" w:cs="Times New Roman"/>
+              </w:rPr>
+              <w:t>March 25</w:t>
+            </w:r>
           </w:p>
         </w:tc>
       </w:tr>
@@ -2129,7 +2709,7 @@
         </w:rPr>
         <w:t>External Materials</w:t>
       </w:r>
-      <w:ins w:id="4" w:author="Ruhani Jindal" w:date="2025-01-20T18:13:00Z" w16du:dateUtc="2025-01-21T00:13:00Z">
+      <w:ins w:id="0" w:author="Ruhani Jindal" w:date="2025-01-20T18:13:00Z" w16du:dateUtc="2025-01-21T00:13:00Z">
         <w:r>
           <w:rPr>
             <w:rFonts w:ascii="Times New Roman" w:hAnsi="Times New Roman" w:cs="Times New Roman"/>

</xml_diff>

<commit_message>
Refine timeline tasks and fix minor wording throughout
</commit_message>
<xml_diff>
--- a/proposal.docx
+++ b/proposal.docx
@@ -33,15 +33,25 @@
           <w:rFonts w:ascii="Times New Roman" w:hAnsi="Times New Roman" w:cs="Times New Roman"/>
           <w:b/>
           <w:bCs/>
+          <w:sz w:val="32"/>
+          <w:szCs w:val="32"/>
+          <w:lang w:val="en-US"/>
+        </w:rPr>
+      </w:pPr>
+    </w:p>
+    <w:p>
+      <w:pPr>
+        <w:jc w:val="center"/>
+        <w:rPr>
+          <w:rFonts w:ascii="Times New Roman" w:hAnsi="Times New Roman" w:cs="Times New Roman"/>
+          <w:b/>
+          <w:bCs/>
           <w:sz w:val="40"/>
           <w:szCs w:val="40"/>
           <w:lang w:val="en-US"/>
         </w:rPr>
       </w:pPr>
-    </w:p>
-    <w:p>
-      <w:pPr>
-        <w:jc w:val="center"/>
+      <w:r>
         <w:rPr>
           <w:rFonts w:ascii="Times New Roman" w:hAnsi="Times New Roman" w:cs="Times New Roman"/>
           <w:b/>
@@ -50,16 +60,6 @@
           <w:szCs w:val="40"/>
           <w:lang w:val="en-US"/>
         </w:rPr>
-      </w:pPr>
-      <w:r>
-        <w:rPr>
-          <w:rFonts w:ascii="Times New Roman" w:hAnsi="Times New Roman" w:cs="Times New Roman"/>
-          <w:b/>
-          <w:bCs/>
-          <w:sz w:val="40"/>
-          <w:szCs w:val="40"/>
-          <w:lang w:val="en-US"/>
-        </w:rPr>
         <w:t>Rummy Card Game</w:t>
       </w:r>
     </w:p>
@@ -191,35 +191,91 @@
           <w:color w:val="000000" w:themeColor="text1"/>
           <w:lang w:val="en-US"/>
         </w:rPr>
-        <w:t xml:space="preserve">For the final project, we have decided to create a card game called rummy. We picked this </w:t>
-      </w:r>
-      <w:proofErr w:type="gramStart"/>
+        <w:t xml:space="preserve">For the final project, we have decided to create a card game called </w:t>
+      </w:r>
       <w:r>
         <w:rPr>
           <w:rFonts w:ascii="Times New Roman" w:eastAsia="Times New Roman" w:hAnsi="Times New Roman" w:cs="Times New Roman"/>
           <w:color w:val="000000" w:themeColor="text1"/>
           <w:lang w:val="en-US"/>
         </w:rPr>
-        <w:t>particular card</w:t>
-      </w:r>
-      <w:proofErr w:type="gramEnd"/>
+        <w:t>Rummy</w:t>
+      </w:r>
       <w:r>
         <w:rPr>
           <w:rFonts w:ascii="Times New Roman" w:eastAsia="Times New Roman" w:hAnsi="Times New Roman" w:cs="Times New Roman"/>
           <w:color w:val="000000" w:themeColor="text1"/>
           <w:lang w:val="en-US"/>
         </w:rPr>
-        <w:t xml:space="preserve"> game because it is not too simple or complex; it suits our programming level. It’s also a perfect game to play against a computer, allowing for the two of us to code different sections of the program.</w:t>
-      </w:r>
-    </w:p>
-    <w:p>
-      <w:pPr>
-        <w:spacing w:after="0"/>
+        <w:t xml:space="preserve">. We picked this </w:t>
+      </w:r>
+      <w:proofErr w:type="gramStart"/>
+      <w:r>
         <w:rPr>
           <w:rFonts w:ascii="Times New Roman" w:eastAsia="Times New Roman" w:hAnsi="Times New Roman" w:cs="Times New Roman"/>
           <w:color w:val="000000" w:themeColor="text1"/>
           <w:lang w:val="en-US"/>
         </w:rPr>
+        <w:t>particular card</w:t>
+      </w:r>
+      <w:proofErr w:type="gramEnd"/>
+      <w:r>
+        <w:rPr>
+          <w:rFonts w:ascii="Times New Roman" w:eastAsia="Times New Roman" w:hAnsi="Times New Roman" w:cs="Times New Roman"/>
+          <w:color w:val="000000" w:themeColor="text1"/>
+          <w:lang w:val="en-US"/>
+        </w:rPr>
+        <w:t xml:space="preserve"> game because it is not too simple or complex; it suits our programming level. </w:t>
+      </w:r>
+      <w:r>
+        <w:rPr>
+          <w:rFonts w:ascii="Times New Roman" w:eastAsia="Times New Roman" w:hAnsi="Times New Roman" w:cs="Times New Roman"/>
+          <w:color w:val="000000" w:themeColor="text1"/>
+          <w:lang w:val="en-US"/>
+        </w:rPr>
+        <w:t>It</w:t>
+      </w:r>
+      <w:r>
+        <w:rPr>
+          <w:rFonts w:ascii="Times New Roman" w:eastAsia="Times New Roman" w:hAnsi="Times New Roman" w:cs="Times New Roman"/>
+          <w:color w:val="000000" w:themeColor="text1"/>
+          <w:lang w:val="en-US"/>
+        </w:rPr>
+        <w:t xml:space="preserve"> is</w:t>
+      </w:r>
+      <w:r>
+        <w:rPr>
+          <w:rFonts w:ascii="Times New Roman" w:eastAsia="Times New Roman" w:hAnsi="Times New Roman" w:cs="Times New Roman"/>
+          <w:color w:val="000000" w:themeColor="text1"/>
+          <w:lang w:val="en-US"/>
+        </w:rPr>
+        <w:t xml:space="preserve"> also a perfect game to play against a computer, </w:t>
+      </w:r>
+      <w:r>
+        <w:rPr>
+          <w:rFonts w:ascii="Times New Roman" w:eastAsia="Times New Roman" w:hAnsi="Times New Roman" w:cs="Times New Roman"/>
+          <w:color w:val="000000" w:themeColor="text1"/>
+          <w:lang w:val="en-US"/>
+        </w:rPr>
+        <w:t>allowing</w:t>
+      </w:r>
+      <w:r>
+        <w:rPr>
+          <w:rFonts w:ascii="Times New Roman" w:eastAsia="Times New Roman" w:hAnsi="Times New Roman" w:cs="Times New Roman"/>
+          <w:color w:val="000000" w:themeColor="text1"/>
+          <w:lang w:val="en-US"/>
+        </w:rPr>
+        <w:t xml:space="preserve"> the two of us to code different sections of the program.</w:t>
+      </w:r>
+    </w:p>
+    <w:p>
+      <w:pPr>
+        <w:spacing w:after="0"/>
+        <w:rPr>
+          <w:rFonts w:ascii="Times New Roman" w:eastAsia="Times New Roman" w:hAnsi="Times New Roman" w:cs="Times New Roman"/>
+          <w:color w:val="000000" w:themeColor="text1"/>
+          <w:lang w:val="en-US"/>
+        </w:rPr>
       </w:pPr>
     </w:p>
     <w:p>
@@ -339,6 +395,12 @@
       </w:r>
     </w:p>
     <w:p>
+      <w:pPr>
+        <w:rPr>
+          <w:rFonts w:ascii="Times New Roman" w:hAnsi="Times New Roman" w:cs="Times New Roman"/>
+          <w:lang w:val="en-US"/>
+        </w:rPr>
+      </w:pPr>
       <w:r>
         <w:rPr>
           <w:rFonts w:ascii="Times New Roman" w:hAnsi="Times New Roman" w:cs="Times New Roman"/>
@@ -346,13 +408,27 @@
         </w:rPr>
         <w:t xml:space="preserve">For example, a run can consist of </w:t>
       </w:r>
+      <w:r>
+        <w:rPr>
+          <w:rFonts w:ascii="Times New Roman" w:hAnsi="Times New Roman" w:cs="Times New Roman"/>
+          <w:lang w:val="en-US"/>
+        </w:rPr>
+        <w:t>one</w:t>
+      </w:r>
+      <w:r>
+        <w:rPr>
+          <w:rFonts w:ascii="Times New Roman" w:hAnsi="Times New Roman" w:cs="Times New Roman"/>
+          <w:lang w:val="en-US"/>
+        </w:rPr>
+        <w:t xml:space="preserve"> </w:t>
+      </w:r>
       <w:proofErr w:type="gramStart"/>
       <w:r>
         <w:rPr>
           <w:rFonts w:ascii="Times New Roman" w:hAnsi="Times New Roman" w:cs="Times New Roman"/>
           <w:lang w:val="en-US"/>
         </w:rPr>
-        <w:t xml:space="preserve">a six </w:t>
+        <w:t xml:space="preserve">six </w:t>
       </w:r>
       <w:r>
         <w:rPr>
@@ -367,16 +443,74 @@
           <w:rFonts w:ascii="Times New Roman" w:hAnsi="Times New Roman" w:cs="Times New Roman"/>
           <w:lang w:val="en-US"/>
         </w:rPr>
-        <w:t xml:space="preserve"> hearts, a seven of spades, and an eight of clubs. Similarly, a set may consist of three sixes of different suits (examples: hearts, spades, and clubs).</w:t>
-      </w:r>
-    </w:p>
-    <w:p>
-      <w:r>
-        <w:rPr>
-          <w:rFonts w:ascii="Times New Roman" w:hAnsi="Times New Roman" w:cs="Times New Roman"/>
-          <w:lang w:val="en-US"/>
-        </w:rPr>
-        <w:t>You can also lay off cards in rummy. Laying off is when a player puts down a card that matches the other player’s meld. For example, if player 1</w:t>
+        <w:t xml:space="preserve"> hearts, </w:t>
+      </w:r>
+      <w:r>
+        <w:rPr>
+          <w:rFonts w:ascii="Times New Roman" w:hAnsi="Times New Roman" w:cs="Times New Roman"/>
+          <w:lang w:val="en-US"/>
+        </w:rPr>
+        <w:t>one</w:t>
+      </w:r>
+      <w:r>
+        <w:rPr>
+          <w:rFonts w:ascii="Times New Roman" w:hAnsi="Times New Roman" w:cs="Times New Roman"/>
+          <w:lang w:val="en-US"/>
+        </w:rPr>
+        <w:t xml:space="preserve"> seven of spades, and </w:t>
+      </w:r>
+      <w:r>
+        <w:rPr>
+          <w:rFonts w:ascii="Times New Roman" w:hAnsi="Times New Roman" w:cs="Times New Roman"/>
+          <w:lang w:val="en-US"/>
+        </w:rPr>
+        <w:t>one</w:t>
+      </w:r>
+      <w:r>
+        <w:rPr>
+          <w:rFonts w:ascii="Times New Roman" w:hAnsi="Times New Roman" w:cs="Times New Roman"/>
+          <w:lang w:val="en-US"/>
+        </w:rPr>
+        <w:t xml:space="preserve"> eight of clubs. Similarly, a set may consist of three sixes of different suits (examples: hearts, spades, and clubs).</w:t>
+      </w:r>
+    </w:p>
+    <w:p>
+      <w:r>
+        <w:rPr>
+          <w:rFonts w:ascii="Times New Roman" w:hAnsi="Times New Roman" w:cs="Times New Roman"/>
+          <w:lang w:val="en-US"/>
+        </w:rPr>
+        <w:t xml:space="preserve">You can also lay off cards in </w:t>
+      </w:r>
+      <w:r>
+        <w:rPr>
+          <w:rFonts w:ascii="Times New Roman" w:hAnsi="Times New Roman" w:cs="Times New Roman"/>
+          <w:lang w:val="en-US"/>
+        </w:rPr>
+        <w:t>R</w:t>
+      </w:r>
+      <w:r>
+        <w:rPr>
+          <w:rFonts w:ascii="Times New Roman" w:hAnsi="Times New Roman" w:cs="Times New Roman"/>
+          <w:lang w:val="en-US"/>
+        </w:rPr>
+        <w:t xml:space="preserve">ummy. Laying off is when a player puts down a card that matches the other player’s </w:t>
+      </w:r>
+      <w:proofErr w:type="gramStart"/>
+      <w:r>
+        <w:rPr>
+          <w:rFonts w:ascii="Times New Roman" w:hAnsi="Times New Roman" w:cs="Times New Roman"/>
+          <w:lang w:val="en-US"/>
+        </w:rPr>
+        <w:t>meld</w:t>
+      </w:r>
+      <w:proofErr w:type="gramEnd"/>
+      <w:r>
+        <w:rPr>
+          <w:rFonts w:ascii="Times New Roman" w:hAnsi="Times New Roman" w:cs="Times New Roman"/>
+          <w:lang w:val="en-US"/>
+        </w:rPr>
+        <w:t>. For example, if player 1</w:t>
       </w:r>
       <w:r>
         <w:rPr>
@@ -405,7 +539,7 @@
           <w:rFonts w:ascii="Times New Roman" w:hAnsi="Times New Roman" w:cs="Times New Roman"/>
           <w:lang w:val="en-US"/>
         </w:rPr>
-        <w:t>At the start of the game, the cards are shuffled by the dealer and each player is dealt ten cards. The remaining cards are placed in the center of the table to form the stock. The first card of the stock is placed faced up beside the pile to start off the discard pile (this leaves us with two different piles: the stock pile and the discard pile</w:t>
+        <w:t>At the start of the game, the cards are shuffled by the dealer and each player is dealt ten cards. The remaining cards are placed in the center of the table to form the stock. The first card of the stock is placed faced up beside the pile to start off the discard pile (this leaves us with two different piles: the stock and the discard pile</w:t>
       </w:r>
       <w:r>
         <w:rPr>
@@ -423,15 +557,13 @@
         </w:rPr>
         <w:t xml:space="preserve">The user will go first, drawing a card from either the stock or the discard pile. Then the player will see if they can create any </w:t>
       </w:r>
-      <w:proofErr w:type="gramStart"/>
-      <w:r>
-        <w:rPr>
-          <w:rFonts w:ascii="Times New Roman" w:hAnsi="Times New Roman" w:cs="Times New Roman"/>
-          <w:lang w:val="en-US"/>
-        </w:rPr>
-        <w:t>meld</w:t>
-      </w:r>
-      <w:proofErr w:type="gramEnd"/>
+      <w:r>
+        <w:rPr>
+          <w:rFonts w:ascii="Times New Roman" w:hAnsi="Times New Roman" w:cs="Times New Roman"/>
+          <w:lang w:val="en-US"/>
+        </w:rPr>
+        <w:t>melded</w:t>
+      </w:r>
       <w:r>
         <w:rPr>
           <w:rFonts w:ascii="Times New Roman" w:hAnsi="Times New Roman" w:cs="Times New Roman"/>
@@ -796,7 +928,23 @@
           <w:rFonts w:ascii="Times New Roman" w:hAnsi="Times New Roman" w:cs="Times New Roman"/>
           <w:lang w:val="en-US"/>
         </w:rPr>
-        <w:t xml:space="preserve"> as well which will be called in the beginning of each game to ensure fairness.</w:t>
+        <w:t xml:space="preserve"> as well which will be called </w:t>
+      </w:r>
+      <w:proofErr w:type="gramStart"/>
+      <w:r>
+        <w:rPr>
+          <w:rFonts w:ascii="Times New Roman" w:hAnsi="Times New Roman" w:cs="Times New Roman"/>
+          <w:lang w:val="en-US"/>
+        </w:rPr>
+        <w:t>in</w:t>
+      </w:r>
+      <w:proofErr w:type="gramEnd"/>
+      <w:r>
+        <w:rPr>
+          <w:rFonts w:ascii="Times New Roman" w:hAnsi="Times New Roman" w:cs="Times New Roman"/>
+          <w:lang w:val="en-US"/>
+        </w:rPr>
+        <w:t xml:space="preserve"> the beginning of each game to ensure fairness.</w:t>
       </w:r>
     </w:p>
     <w:p>
@@ -817,6 +965,7 @@
         </w:rPr>
         <w:t xml:space="preserve">b. </w:t>
       </w:r>
+      <w:proofErr w:type="gramStart"/>
       <w:r>
         <w:rPr>
           <w:rFonts w:ascii="Times New Roman" w:hAnsi="Times New Roman" w:cs="Times New Roman"/>
@@ -835,6 +984,7 @@
         </w:rPr>
         <w:t>Computing Logic</w:t>
       </w:r>
+      <w:proofErr w:type="gramEnd"/>
     </w:p>
     <w:p>
       <w:pPr>
@@ -928,7 +1078,23 @@
           <w:rFonts w:ascii="Times New Roman" w:hAnsi="Times New Roman" w:cs="Times New Roman"/>
           <w:lang w:val="en-US"/>
         </w:rPr>
-        <w:t xml:space="preserve">A round will end if a player wins through successfully melding all their cards, or when </w:t>
+        <w:t xml:space="preserve">A round will end if a player </w:t>
+      </w:r>
+      <w:proofErr w:type="gramStart"/>
+      <w:r>
+        <w:rPr>
+          <w:rFonts w:ascii="Times New Roman" w:hAnsi="Times New Roman" w:cs="Times New Roman"/>
+          <w:lang w:val="en-US"/>
+        </w:rPr>
+        <w:t>wins through</w:t>
+      </w:r>
+      <w:proofErr w:type="gramEnd"/>
+      <w:r>
+        <w:rPr>
+          <w:rFonts w:ascii="Times New Roman" w:hAnsi="Times New Roman" w:cs="Times New Roman"/>
+          <w:lang w:val="en-US"/>
+        </w:rPr>
+        <w:t xml:space="preserve"> successfully melding all their cards, or when </w:t>
       </w:r>
       <w:r>
         <w:rPr>
@@ -1107,7 +1273,23 @@
           <w:rFonts w:ascii="Times New Roman" w:hAnsi="Times New Roman" w:cs="Times New Roman"/>
           <w:lang w:val="en-US"/>
         </w:rPr>
-        <w:t xml:space="preserve">will also be instructions on how to input valid melds and how to show your turn so the program detects them. </w:t>
+        <w:t xml:space="preserve">will also be instructions on how to input valid </w:t>
+      </w:r>
+      <w:proofErr w:type="gramStart"/>
+      <w:r>
+        <w:rPr>
+          <w:rFonts w:ascii="Times New Roman" w:hAnsi="Times New Roman" w:cs="Times New Roman"/>
+          <w:lang w:val="en-US"/>
+        </w:rPr>
+        <w:t>melds</w:t>
+      </w:r>
+      <w:proofErr w:type="gramEnd"/>
+      <w:r>
+        <w:rPr>
+          <w:rFonts w:ascii="Times New Roman" w:hAnsi="Times New Roman" w:cs="Times New Roman"/>
+          <w:lang w:val="en-US"/>
+        </w:rPr>
+        <w:t xml:space="preserve"> and how to show your turn so the program detects them. </w:t>
       </w:r>
     </w:p>
     <w:p>
@@ -1755,9 +1937,14 @@
             <w:r>
               <w:rPr>
                 <w:rFonts w:ascii="Times New Roman" w:hAnsi="Times New Roman" w:cs="Times New Roman"/>
-                <w:lang w:val="en-US"/>
-              </w:rPr>
-              <w:t>Making card deck and shuffling function</w:t>
+              </w:rPr>
+              <w:t xml:space="preserve">Develop card deck and shuffling </w:t>
+            </w:r>
+            <w:r>
+              <w:rPr>
+                <w:rFonts w:ascii="Times New Roman" w:hAnsi="Times New Roman" w:cs="Times New Roman"/>
+              </w:rPr>
+              <w:t>function</w:t>
             </w:r>
           </w:p>
         </w:tc>
@@ -1818,7 +2005,13 @@
               <w:rPr>
                 <w:rFonts w:ascii="Times New Roman" w:hAnsi="Times New Roman" w:cs="Times New Roman"/>
               </w:rPr>
-              <w:t>Design and implement the instructions screen that appears at the beginning of the game</w:t>
+              <w:t xml:space="preserve">Design and implement the instructions screen </w:t>
+            </w:r>
+            <w:r>
+              <w:rPr>
+                <w:rFonts w:ascii="Times New Roman" w:hAnsi="Times New Roman" w:cs="Times New Roman"/>
+              </w:rPr>
+              <w:t>(game introduction)</w:t>
             </w:r>
           </w:p>
         </w:tc>
@@ -1878,24 +2071,8 @@
             <w:r>
               <w:rPr>
                 <w:rFonts w:ascii="Times New Roman" w:hAnsi="Times New Roman" w:cs="Times New Roman"/>
-                <w:lang w:val="en-US"/>
-              </w:rPr>
-              <w:t xml:space="preserve">User Interface </w:t>
-            </w:r>
-          </w:p>
-          <w:p>
-            <w:pPr>
-              <w:rPr>
-                <w:rFonts w:ascii="Times New Roman" w:hAnsi="Times New Roman" w:cs="Times New Roman"/>
-                <w:lang w:val="en-US"/>
-              </w:rPr>
-            </w:pPr>
-            <w:r>
-              <w:rPr>
-                <w:rFonts w:ascii="Times New Roman" w:hAnsi="Times New Roman" w:cs="Times New Roman"/>
-                <w:lang w:val="en-US"/>
-              </w:rPr>
-              <w:t>– what the user sees in each turn</w:t>
+              </w:rPr>
+              <w:t>Create and design game interface (player’s view for each turn)</w:t>
             </w:r>
           </w:p>
         </w:tc>
@@ -1916,6 +2093,73 @@
                 <w:lang w:val="en-US"/>
               </w:rPr>
               <w:t>Ruhani</w:t>
+            </w:r>
+          </w:p>
+        </w:tc>
+        <w:tc>
+          <w:tcPr>
+            <w:tcW w:w="1776" w:type="dxa"/>
+          </w:tcPr>
+          <w:p>
+            <w:pPr>
+              <w:rPr>
+                <w:rFonts w:ascii="Times New Roman" w:hAnsi="Times New Roman" w:cs="Times New Roman"/>
+                <w:lang w:val="en-US"/>
+              </w:rPr>
+            </w:pPr>
+            <w:r>
+              <w:rPr>
+                <w:rFonts w:ascii="Times New Roman" w:hAnsi="Times New Roman" w:cs="Times New Roman"/>
+                <w:lang w:val="en-US"/>
+              </w:rPr>
+              <w:t>February 1</w:t>
+            </w:r>
+            <w:r>
+              <w:rPr>
+                <w:rFonts w:ascii="Times New Roman" w:hAnsi="Times New Roman" w:cs="Times New Roman"/>
+                <w:lang w:val="en-US"/>
+              </w:rPr>
+              <w:t>3</w:t>
+            </w:r>
+          </w:p>
+        </w:tc>
+      </w:tr>
+      <w:tr>
+        <w:tc>
+          <w:tcPr>
+            <w:tcW w:w="5524" w:type="dxa"/>
+          </w:tcPr>
+          <w:p>
+            <w:pPr>
+              <w:rPr>
+                <w:rFonts w:ascii="Times New Roman" w:hAnsi="Times New Roman" w:cs="Times New Roman"/>
+              </w:rPr>
+            </w:pPr>
+            <w:r>
+              <w:rPr>
+                <w:rFonts w:ascii="Times New Roman" w:hAnsi="Times New Roman" w:cs="Times New Roman"/>
+              </w:rPr>
+              <w:t>Integrate UI with game logic (meld detection, laying off cards, etc.)</w:t>
+            </w:r>
+          </w:p>
+        </w:tc>
+        <w:tc>
+          <w:tcPr>
+            <w:tcW w:w="272" w:type="dxa"/>
+          </w:tcPr>
+          <w:p>
+            <w:pPr>
+              <w:rPr>
+                <w:rFonts w:ascii="Times New Roman" w:hAnsi="Times New Roman" w:cs="Times New Roman"/>
+                <w:lang w:val="en-US"/>
+              </w:rPr>
+            </w:pPr>
+            <w:r>
+              <w:rPr>
+                <w:rFonts w:ascii="Times New Roman" w:hAnsi="Times New Roman" w:cs="Times New Roman"/>
+                <w:lang w:val="en-US"/>
+              </w:rPr>
+              <w:t>Both</w:t>
             </w:r>
           </w:p>
         </w:tc>
@@ -1962,9 +2206,8 @@
             <w:r>
               <w:rPr>
                 <w:rFonts w:ascii="Times New Roman" w:hAnsi="Times New Roman" w:cs="Times New Roman"/>
-                <w:lang w:val="en-US"/>
-              </w:rPr>
-              <w:t>Meld Detection</w:t>
+              </w:rPr>
+              <w:t>Implement meld detection logic (valid sets and runs)</w:t>
             </w:r>
           </w:p>
         </w:tc>
@@ -2011,7 +2254,14 @@
                 <w:rFonts w:ascii="Times New Roman" w:hAnsi="Times New Roman" w:cs="Times New Roman"/>
                 <w:lang w:val="en-US"/>
               </w:rPr>
-              <w:t>25</w:t>
+              <w:t>2</w:t>
+            </w:r>
+            <w:r>
+              <w:rPr>
+                <w:rFonts w:ascii="Times New Roman" w:hAnsi="Times New Roman" w:cs="Times New Roman"/>
+                <w:lang w:val="en-US"/>
+              </w:rPr>
+              <w:t>5</w:t>
             </w:r>
           </w:p>
         </w:tc>
@@ -2031,9 +2281,8 @@
             <w:r>
               <w:rPr>
                 <w:rFonts w:ascii="Times New Roman" w:hAnsi="Times New Roman" w:cs="Times New Roman"/>
-                <w:lang w:val="en-US"/>
-              </w:rPr>
-              <w:t>Laying off a card</w:t>
+              </w:rPr>
+              <w:t>Implement card laying logic (allow players to add to existing melds)</w:t>
             </w:r>
           </w:p>
         </w:tc>
@@ -2097,6 +2346,13 @@
               </w:rPr>
               <w:t>Win Detection</w:t>
             </w:r>
+            <w:r>
+              <w:rPr>
+                <w:rFonts w:ascii="Times New Roman" w:hAnsi="Times New Roman" w:cs="Times New Roman"/>
+                <w:lang w:val="en-US"/>
+              </w:rPr>
+              <w:t xml:space="preserve"> logic (identify winning hands)</w:t>
+            </w:r>
           </w:p>
         </w:tc>
         <w:tc>
@@ -2155,37 +2411,8 @@
             <w:r>
               <w:rPr>
                 <w:rFonts w:ascii="Times New Roman" w:hAnsi="Times New Roman" w:cs="Times New Roman"/>
-                <w:lang w:val="en-US"/>
-              </w:rPr>
-              <w:t xml:space="preserve">Make </w:t>
-            </w:r>
-            <w:r>
-              <w:rPr>
-                <w:rFonts w:ascii="Times New Roman" w:hAnsi="Times New Roman" w:cs="Times New Roman"/>
-                <w:lang w:val="en-US"/>
-              </w:rPr>
-              <w:t xml:space="preserve">a winning screen </w:t>
-            </w:r>
-            <w:r>
-              <w:rPr>
-                <w:rFonts w:ascii="Times New Roman" w:hAnsi="Times New Roman" w:cs="Times New Roman"/>
-                <w:lang w:val="en-US"/>
-              </w:rPr>
-              <w:t xml:space="preserve">for </w:t>
-            </w:r>
-            <w:r>
-              <w:rPr>
-                <w:rFonts w:ascii="Times New Roman" w:hAnsi="Times New Roman" w:cs="Times New Roman"/>
-                <w:lang w:val="en-US"/>
-              </w:rPr>
-              <w:t>the end of</w:t>
-            </w:r>
-            <w:r>
-              <w:rPr>
-                <w:rFonts w:ascii="Times New Roman" w:hAnsi="Times New Roman" w:cs="Times New Roman"/>
-                <w:lang w:val="en-US"/>
-              </w:rPr>
-              <w:t xml:space="preserve"> the game</w:t>
+              </w:rPr>
+              <w:t>Design and implement end-of-game screen (show winner and stats)</w:t>
             </w:r>
           </w:p>
         </w:tc>
@@ -2225,21 +2452,7 @@
                 <w:rFonts w:ascii="Times New Roman" w:hAnsi="Times New Roman" w:cs="Times New Roman"/>
                 <w:lang w:val="en-US"/>
               </w:rPr>
-              <w:t>March</w:t>
-            </w:r>
-            <w:r>
-              <w:rPr>
-                <w:rFonts w:ascii="Times New Roman" w:hAnsi="Times New Roman" w:cs="Times New Roman"/>
-                <w:lang w:val="en-US"/>
-              </w:rPr>
-              <w:t xml:space="preserve"> 1</w:t>
-            </w:r>
-            <w:r>
-              <w:rPr>
-                <w:rFonts w:ascii="Times New Roman" w:hAnsi="Times New Roman" w:cs="Times New Roman"/>
-                <w:lang w:val="en-US"/>
-              </w:rPr>
-              <w:t>1</w:t>
+              <w:t>March 11</w:t>
             </w:r>
           </w:p>
         </w:tc>
@@ -2645,6 +2858,7 @@
         </w:numPr>
         <w:rPr>
           <w:rFonts w:ascii="Times New Roman" w:hAnsi="Times New Roman" w:cs="Times New Roman"/>
+          <w:lang w:val="en-US"/>
         </w:rPr>
       </w:pPr>
       <w:r>
@@ -2661,13 +2875,12 @@
         </w:rPr>
         <w:t>: A simple CLI that is intuitive, displaying game progress and prompting for player actions.</w:t>
       </w:r>
-    </w:p>
-    <w:p>
-      <w:pPr>
-        <w:rPr>
-          <w:rFonts w:ascii="Times New Roman" w:hAnsi="Times New Roman" w:cs="Times New Roman"/>
-        </w:rPr>
-      </w:pPr>
+      <w:r>
+        <w:rPr>
+          <w:rFonts w:ascii="Times New Roman" w:hAnsi="Times New Roman" w:cs="Times New Roman"/>
+        </w:rPr>
+        <w:t xml:space="preserve"> </w:t>
+      </w:r>
       <w:r>
         <w:rPr>
           <w:rFonts w:ascii="Times New Roman" w:hAnsi="Times New Roman" w:cs="Times New Roman"/>
@@ -2686,65 +2899,6 @@
         </w:rPr>
         <w:t>.</w:t>
       </w:r>
-    </w:p>
-    <w:p>
-      <w:pPr>
-        <w:rPr>
-          <w:rFonts w:ascii="Times New Roman" w:hAnsi="Times New Roman" w:cs="Times New Roman"/>
-          <w:b/>
-          <w:bCs/>
-          <w:sz w:val="28"/>
-          <w:szCs w:val="28"/>
-          <w:lang w:val="en-US"/>
-        </w:rPr>
-      </w:pPr>
-      <w:r>
-        <w:rPr>
-          <w:rFonts w:ascii="Times New Roman" w:hAnsi="Times New Roman" w:cs="Times New Roman"/>
-          <w:b/>
-          <w:bCs/>
-          <w:sz w:val="28"/>
-          <w:szCs w:val="28"/>
-          <w:lang w:val="en-US"/>
-        </w:rPr>
-        <w:t>External Materials</w:t>
-      </w:r>
-      <w:ins w:id="0" w:author="Ruhani Jindal" w:date="2025-01-20T18:13:00Z" w16du:dateUtc="2025-01-21T00:13:00Z">
-        <w:r>
-          <w:rPr>
-            <w:rFonts w:ascii="Times New Roman" w:hAnsi="Times New Roman" w:cs="Times New Roman"/>
-            <w:b/>
-            <w:bCs/>
-            <w:sz w:val="28"/>
-            <w:szCs w:val="28"/>
-            <w:lang w:val="en-US"/>
-          </w:rPr>
-          <w:t xml:space="preserve"> (Optional)</w:t>
-        </w:r>
-      </w:ins>
-    </w:p>
-    <w:p>
-      <w:pPr>
-        <w:pStyle w:val="ListParagraph"/>
-        <w:numPr>
-          <w:ilvl w:val="0"/>
-          <w:numId w:val="1"/>
-        </w:numPr>
-        <w:rPr>
-          <w:rFonts w:ascii="Times New Roman" w:hAnsi="Times New Roman" w:cs="Times New Roman"/>
-          <w:lang w:val="en-US"/>
-        </w:rPr>
-      </w:pPr>
-    </w:p>
-    <w:p>
-      <w:pPr>
-        <w:rPr>
-          <w:rFonts w:ascii="Times New Roman" w:hAnsi="Times New Roman" w:cs="Times New Roman"/>
-          <w:sz w:val="28"/>
-          <w:szCs w:val="28"/>
-          <w:lang w:val="en-US"/>
-        </w:rPr>
-      </w:pPr>
     </w:p>
     <w:sectPr>
       <w:pgSz w:w="12240" w:h="15840"/>
@@ -4738,14 +4892,6 @@
     <w:abstractNumId w:val="16"/>
   </w:num>
 </w:numbering>
-</file>
-
-<file path=word/people.xml><?xml version="1.0" encoding="utf-8"?>
-<w15:people xmlns:wpc="http://schemas.microsoft.com/office/word/2010/wordprocessingCanvas" xmlns:cx="http://schemas.microsoft.com/office/drawing/2014/chartex" xmlns:cx1="http://schemas.microsoft.com/office/drawing/2015/9/8/chartex" xmlns:cx2="http://schemas.microsoft.com/office/drawing/2015/10/21/chartex" xmlns:cx3="http://schemas.microsoft.com/office/drawing/2016/5/9/chartex" xmlns:cx4="http://schemas.microsoft.com/office/drawing/2016/5/10/chartex" xmlns:cx5="http://schemas.microsoft.com/office/drawing/2016/5/11/chartex" xmlns:cx6="http://schemas.microsoft.com/office/drawing/2016/5/12/chartex" xmlns:cx7="http://schemas.microsoft.com/office/drawing/2016/5/13/chartex" xmlns:cx8="http://schemas.microsoft.com/office/drawing/2016/5/14/chartex" xmlns:mc="http://schemas.openxmlformats.org/markup-compatibility/2006" xmlns:aink="http://schemas.microsoft.com/office/drawing/2016/ink" xmlns:am3d="http://schemas.microsoft.com/office/drawing/2017/model3d" xmlns:o="urn:schemas-microsoft-com:office:office" xmlns:oel="http://schemas.microsoft.com/office/2019/extlst" xmlns:r="http://schemas.openxmlformats.org/officeDocument/2006/relationships" xmlns:m="http://schemas.openxmlformats.org/officeDocument/2006/math" xmlns:v="urn:schemas-microsoft-com:vml" xmlns:wp14="http://schemas.microsoft.com/office/word/2010/wordprocessingDrawing" xmlns:wp="http://schemas.openxmlformats.org/drawingml/2006/wordprocessingDrawing" xmlns:w10="urn:schemas-microsoft-com:office:word" xmlns:w="http://schemas.openxmlformats.org/wordprocessingml/2006/main" xmlns:w14="http://schemas.microsoft.com/office/word/2010/wordml" xmlns:w15="http://schemas.microsoft.com/office/word/2012/wordml" xmlns:w16cex="http://schemas.microsoft.com/office/word/2018/wordml/cex" xmlns:w16cid="http://schemas.microsoft.com/office/word/2016/wordml/cid" xmlns:w16="http://schemas.microsoft.com/office/word/2018/wordml" xmlns:w16du="http://schemas.microsoft.com/office/word/2023/wordml/word16du" xmlns:w16sdtdh="http://schemas.microsoft.com/office/word/2020/wordml/sdtdatahash" xmlns:w16sdtfl="http://schemas.microsoft.com/office/word/2024/wordml/sdtformatlock" xmlns:w16se="http://schemas.microsoft.com/office/word/2015/wordml/symex" xmlns:wpg="http://schemas.microsoft.com/office/word/2010/wordprocessingGroup" xmlns:wpi="http://schemas.microsoft.com/office/word/2010/wordprocessingInk" xmlns:wne="http://schemas.microsoft.com/office/word/2006/wordml" xmlns:wps="http://schemas.microsoft.com/office/word/2010/wordprocessingShape" mc:Ignorable="w14 w15 w16se w16cid w16 w16cex w16sdtdh w16sdtfl w16du wp14">
-  <w15:person w15:author="Ruhani Jindal">
-    <w15:presenceInfo w15:providerId="AD" w15:userId="S::jindal-r@webmail.uwinnipeg.ca::29e04c13-a62b-4946-9cb0-ed846c343292"/>
-  </w15:person>
-</w15:people>
 </file>
 
 <file path=word/styles.xml><?xml version="1.0" encoding="utf-8"?>

</xml_diff>